<commit_message>
Update editor memo: sources now 70, trade-source scrutiny standard
</commit_message>
<xml_diff>
--- a/files/goodlede-improvements-memo.docx
+++ b/files/goodlede-improvements-memo.docx
@@ -411,13 +411,13 @@
       </w:r>
     </w:p>
     <w:bookmarkEnd w:id="23"/>
-    <w:bookmarkStart w:id="24" w:name="sources"/>
+    <w:bookmarkStart w:id="24" w:name="sources-and-editorial-standards"/>
     <w:p>
       <w:pPr>
         <w:pStyle w:val="Heading3"/>
       </w:pPr>
       <w:r>
-        <w:t xml:space="preserve">4. Sources</w:t>
+        <w:t xml:space="preserve">4. Sources and editorial standards</w:t>
       </w:r>
     </w:p>
     <w:p>
@@ -439,10 +439,10 @@
           <w:bCs/>
           <w:b/>
         </w:rPr>
-        <w:t xml:space="preserve">41 to 60 feeds</w:t>
-      </w:r>
-      <w:r>
-        <w:t xml:space="preserve">, weighted toward conservation NGOs and environmental outlets (Yale Environment 360, Ocean Conservancy, Rewilding Europe, BirdLife, Canary Media, Anthropocene, and more).</w:t>
+        <w:t xml:space="preserve">41 to 70 feeds</w:t>
+      </w:r>
+      <w:r>
+        <w:t xml:space="preserve">, weighted toward conservation NGOs and environmental outlets (Yale Environment 360, Ocean Conservancy, Rewilding Europe, BirdLife, Re:wild, Canary Media, Anthropocene, Knowable Magazine, and more).</w:t>
       </w:r>
     </w:p>
     <w:p>
@@ -467,7 +467,7 @@
         <w:t xml:space="preserve">weekly automatic search for new, reputable good-news feeds</w:t>
       </w:r>
       <w:r>
-        <w:t xml:space="preserve">, surfaced for approval before anything is added.</w:t>
+        <w:t xml:space="preserve">, surfaced for approval before anything is added — so the roster keeps growing on its own.</w:t>
       </w:r>
     </w:p>
     <w:p>
@@ -479,7 +479,36 @@
         <w:pStyle w:val="Compact"/>
       </w:pPr>
       <w:r>
-        <w:t xml:space="preserve">Companion-animal stories now route to the Animals category, even when framed around health.</w:t>
+        <w:t xml:space="preserve">The system now enforces</w:t>
+      </w:r>
+      <w:r>
+        <w:t xml:space="preserve"> </w:t>
+      </w:r>
+      <w:r>
+        <w:rPr>
+          <w:bCs/>
+          <w:b/>
+        </w:rPr>
+        <w:t xml:space="preserve">the editorial standards you set</w:t>
+      </w:r>
+      <w:r>
+        <w:t xml:space="preserve">, automatically. Two examples already in place: companion-animal stories route to the Animals category even when framed around health; and</w:t>
+      </w:r>
+      <w:r>
+        <w:t xml:space="preserve"> </w:t>
+      </w:r>
+      <w:r>
+        <w:rPr>
+          <w:bCs/>
+          <w:b/>
+        </w:rPr>
+        <w:t xml:space="preserve">trade and industry publications get extra scrutiny</w:t>
+      </w:r>
+      <w:r>
+        <w:t xml:space="preserve"> </w:t>
+      </w:r>
+      <w:r>
+        <w:t xml:space="preserve">— vendor press releases, product and funding announcements, and industry-booster pieces are rejected, with only concrete, genuinely-good developments allowed through.</w:t>
       </w:r>
     </w:p>
     <w:bookmarkEnd w:id="24"/>
@@ -686,7 +715,7 @@
         <w:t xml:space="preserve">curation and voice</w:t>
       </w:r>
       <w:r>
-        <w:t xml:space="preserve">: deciding what is genuinely good, true, and worth a reader’s two minutes; shaping the disclaimers, which the system then learns from; and choosing each day’s lead story. The tooling is built so that is a few minutes of focused clicks, not a chore.</w:t>
+        <w:t xml:space="preserve">: deciding what is genuinely good, true, and worth a reader’s two minutes; shaping the disclaimers, which the system then learns from; setting standards it then enforces; and choosing each day’s lead story. The tooling is built so that is a few minutes of focused clicks, not a chore.</w:t>
       </w:r>
     </w:p>
     <w:p>

</xml_diff>